<commit_message>
docs: regenerate payment questionnaire Word as clean English Arial
Co-authored-by: Ben He <woheshiwen@users.noreply.github.com>
</commit_message>
<xml_diff>
--- a/docs/Payment-Tracking-Real-Process-Collection.docx
+++ b/docs/Payment-Tracking-Real-Process-Collection.docx
@@ -7,67 +7,113 @@
         <w:pStyle w:val="Title"/>
       </w:pPr>
       <w:r>
-        <w:t>Payment Status Tracking — Real Process Collection</w:t>
+        <w:rPr>
+          <w:rFonts w:ascii="Arial" w:hAnsi="Arial" w:cs="Arial" w:eastAsia="Arial"/>
+          <w:b/>
+          <w:i w:val="0"/>
+          <w:sz w:val="32"/>
+        </w:rPr>
+        <w:t>Payment Status Tracking - Real Process Collection</w:t>
       </w:r>
     </w:p>
     <w:p>
       <w:r>
         <w:rPr>
+          <w:rFonts w:ascii="Arial" w:hAnsi="Arial" w:cs="Arial" w:eastAsia="Arial"/>
           <w:b/>
+          <w:i w:val="0"/>
+          <w:sz w:val="22"/>
         </w:rPr>
         <w:t xml:space="preserve">Purpose: </w:t>
       </w:r>
       <w:r>
-        <w:t xml:space="preserve">Before designing any system or AI workflow, we need to understand </w:t>
+        <w:rPr>
+          <w:rFonts w:ascii="Arial" w:hAnsi="Arial" w:cs="Arial" w:eastAsia="Arial"/>
+          <w:b w:val="0"/>
+          <w:i w:val="0"/>
+          <w:sz w:val="22"/>
+        </w:rPr>
+        <w:t>Before designing any system or AI workflow, we need to understand one real payment follow-up and recording process end to end.</w:t>
+      </w:r>
+    </w:p>
+    <w:p>
+      <w:r>
+        <w:rPr>
+          <w:rFonts w:ascii="Arial" w:hAnsi="Arial" w:cs="Arial" w:eastAsia="Arial"/>
+          <w:b/>
+          <w:i w:val="0"/>
+          <w:sz w:val="22"/>
+        </w:rPr>
+        <w:t xml:space="preserve">Instruction: </w:t>
       </w:r>
       <w:r>
         <w:rPr>
-          <w:b/>
+          <w:rFonts w:ascii="Arial" w:hAnsi="Arial" w:cs="Arial" w:eastAsia="Arial"/>
+          <w:b w:val="0"/>
+          <w:i w:val="0"/>
+          <w:sz w:val="22"/>
         </w:rPr>
-        <w:t>one real payment follow-up and recording process</w:t>
+        <w:t>Please describe how a real project payment is tracked today, using an actual example if possible. The project name may be anonymized.</w:t>
       </w:r>
-      <w:r>
-        <w:t xml:space="preserve"> end to end.</w:t>
-        <w:br/>
-      </w:r>
+    </w:p>
+    <w:p>
       <w:r>
         <w:rPr>
-          <w:i/>
-        </w:rPr>
-        <w:t>Please describe how a real project payment is tracked today</w:t>
-      </w:r>
-      <w:r>
-        <w:t>, using an actual example if possible (project name may be anonymized).</w:t>
-        <w:br/>
-      </w:r>
-      <w:r>
-        <w:rPr>
+          <w:rFonts w:ascii="Arial" w:hAnsi="Arial" w:cs="Arial" w:eastAsia="Arial"/>
           <w:b/>
+          <w:i w:val="0"/>
+          <w:sz w:val="22"/>
         </w:rPr>
         <w:t xml:space="preserve">Owner (IT/AI): </w:t>
       </w:r>
       <w:r>
+        <w:rPr>
+          <w:rFonts w:ascii="Arial" w:hAnsi="Arial" w:cs="Arial" w:eastAsia="Arial"/>
+          <w:b w:val="0"/>
+          <w:i w:val="0"/>
+          <w:sz w:val="22"/>
+        </w:rPr>
         <w:t>Ben He</w:t>
-        <w:br/>
       </w:r>
+    </w:p>
+    <w:p>
       <w:r>
         <w:rPr>
+          <w:rFonts w:ascii="Arial" w:hAnsi="Arial" w:cs="Arial" w:eastAsia="Arial"/>
           <w:b/>
+          <w:i w:val="0"/>
+          <w:sz w:val="22"/>
         </w:rPr>
         <w:t xml:space="preserve">Date: </w:t>
       </w:r>
       <w:r>
+        <w:rPr>
+          <w:rFonts w:ascii="Arial" w:hAnsi="Arial" w:cs="Arial" w:eastAsia="Arial"/>
+          <w:b w:val="0"/>
+          <w:i w:val="0"/>
+          <w:sz w:val="22"/>
+        </w:rPr>
         <w:t>2026-10-02</w:t>
-        <w:br/>
       </w:r>
+    </w:p>
+    <w:p>
       <w:r>
         <w:rPr>
+          <w:rFonts w:ascii="Arial" w:hAnsi="Arial" w:cs="Arial" w:eastAsia="Arial"/>
           <w:b/>
+          <w:i w:val="0"/>
+          <w:sz w:val="22"/>
         </w:rPr>
         <w:t xml:space="preserve">Version: </w:t>
       </w:r>
       <w:r>
-        <w:t>0.2</w:t>
+        <w:rPr>
+          <w:rFonts w:ascii="Arial" w:hAnsi="Arial" w:cs="Arial" w:eastAsia="Arial"/>
+          <w:b w:val="0"/>
+          <w:i w:val="0"/>
+          <w:sz w:val="22"/>
+        </w:rPr>
+        <w:t>0.3 (English)</w:t>
       </w:r>
     </w:p>
     <w:p>
@@ -75,17 +121,35 @@
         <w:pStyle w:val="Heading1"/>
       </w:pPr>
       <w:r>
+        <w:rPr>
+          <w:rFonts w:ascii="Arial" w:hAnsi="Arial" w:cs="Arial" w:eastAsia="Arial"/>
+          <w:b/>
+          <w:i w:val="0"/>
+          <w:sz w:val="28"/>
+        </w:rPr>
         <w:t>What we need from you</w:t>
       </w:r>
     </w:p>
     <w:p>
       <w:r>
-        <w:t>Please pick one real payment case from the past 1–3 months (e.g. one milestone / one invoice) and answer the questions below.</w:t>
+        <w:rPr>
+          <w:rFonts w:ascii="Arial" w:hAnsi="Arial" w:cs="Arial" w:eastAsia="Arial"/>
+          <w:b w:val="0"/>
+          <w:i w:val="0"/>
+          <w:sz w:val="22"/>
+        </w:rPr>
+        <w:t>Please pick one real payment case from the past 1-3 months (for example, one milestone or one invoice) and answer the questions below.</w:t>
       </w:r>
     </w:p>
     <w:p>
       <w:r>
-        <w:t>You may anonymize the client name (e.g. “Client A”, “Project X”). Amounts can be approximate if needed.</w:t>
+        <w:rPr>
+          <w:rFonts w:ascii="Arial" w:hAnsi="Arial" w:cs="Arial" w:eastAsia="Arial"/>
+          <w:b w:val="0"/>
+          <w:i w:val="0"/>
+          <w:sz w:val="22"/>
+        </w:rPr>
+        <w:t>You may anonymize the client name (for example, Client A / Project X). Amounts can be approximate if needed.</w:t>
       </w:r>
     </w:p>
     <w:p>
@@ -93,6 +157,12 @@
         <w:pStyle w:val="Heading1"/>
       </w:pPr>
       <w:r>
+        <w:rPr>
+          <w:rFonts w:ascii="Arial" w:hAnsi="Arial" w:cs="Arial" w:eastAsia="Arial"/>
+          <w:b/>
+          <w:i w:val="0"/>
+          <w:sz w:val="28"/>
+        </w:rPr>
         <w:t>1. Basic case info</w:t>
       </w:r>
     </w:p>
@@ -115,7 +185,9 @@
             <w:r/>
             <w:r>
               <w:rPr>
+                <w:rFonts w:ascii="Arial" w:hAnsi="Arial" w:cs="Arial" w:eastAsia="Arial"/>
                 <w:b/>
+                <w:i w:val="0"/>
                 <w:sz w:val="20"/>
               </w:rPr>
               <w:t>Item</w:t>
@@ -130,7 +202,9 @@
             <w:r/>
             <w:r>
               <w:rPr>
+                <w:rFonts w:ascii="Arial" w:hAnsi="Arial" w:cs="Arial" w:eastAsia="Arial"/>
                 <w:b/>
+                <w:i w:val="0"/>
                 <w:sz w:val="20"/>
               </w:rPr>
               <w:t>Your answer</w:t>
@@ -147,7 +221,9 @@
             <w:r/>
             <w:r>
               <w:rPr>
+                <w:rFonts w:ascii="Arial" w:hAnsi="Arial" w:cs="Arial" w:eastAsia="Arial"/>
                 <w:b w:val="0"/>
+                <w:i w:val="0"/>
                 <w:sz w:val="20"/>
               </w:rPr>
               <w:t>Project name / code (or anonymized)</w:t>
@@ -162,7 +238,9 @@
             <w:r/>
             <w:r>
               <w:rPr>
+                <w:rFonts w:ascii="Arial" w:hAnsi="Arial" w:cs="Arial" w:eastAsia="Arial"/>
                 <w:b w:val="0"/>
+                <w:i w:val="0"/>
                 <w:sz w:val="20"/>
               </w:rPr>
             </w:r>
@@ -178,10 +256,12 @@
             <w:r/>
             <w:r>
               <w:rPr>
+                <w:rFonts w:ascii="Arial" w:hAnsi="Arial" w:cs="Arial" w:eastAsia="Arial"/>
                 <w:b w:val="0"/>
+                <w:i w:val="0"/>
                 <w:sz w:val="20"/>
               </w:rPr>
-              <w:t>Payment type (e.g. deposit / progress / final / retention)</w:t>
+              <w:t>Payment type (deposit / progress / final / retention / other)</w:t>
             </w:r>
           </w:p>
         </w:tc>
@@ -193,7 +273,9 @@
             <w:r/>
             <w:r>
               <w:rPr>
+                <w:rFonts w:ascii="Arial" w:hAnsi="Arial" w:cs="Arial" w:eastAsia="Arial"/>
                 <w:b w:val="0"/>
+                <w:i w:val="0"/>
                 <w:sz w:val="20"/>
               </w:rPr>
             </w:r>
@@ -209,10 +291,12 @@
             <w:r/>
             <w:r>
               <w:rPr>
+                <w:rFonts w:ascii="Arial" w:hAnsi="Arial" w:cs="Arial" w:eastAsia="Arial"/>
                 <w:b w:val="0"/>
+                <w:i w:val="0"/>
                 <w:sz w:val="20"/>
               </w:rPr>
-              <w:t>Invoice / milestone amount (approx. OK)</w:t>
+              <w:t>Invoice or milestone amount (approx. OK)</w:t>
             </w:r>
           </w:p>
         </w:tc>
@@ -224,7 +308,9 @@
             <w:r/>
             <w:r>
               <w:rPr>
+                <w:rFonts w:ascii="Arial" w:hAnsi="Arial" w:cs="Arial" w:eastAsia="Arial"/>
                 <w:b w:val="0"/>
+                <w:i w:val="0"/>
                 <w:sz w:val="20"/>
               </w:rPr>
             </w:r>
@@ -240,7 +326,9 @@
             <w:r/>
             <w:r>
               <w:rPr>
+                <w:rFonts w:ascii="Arial" w:hAnsi="Arial" w:cs="Arial" w:eastAsia="Arial"/>
                 <w:b w:val="0"/>
+                <w:i w:val="0"/>
                 <w:sz w:val="20"/>
               </w:rPr>
               <w:t>Who owns follow-up (name + role)</w:t>
@@ -255,7 +343,9 @@
             <w:r/>
             <w:r>
               <w:rPr>
+                <w:rFonts w:ascii="Arial" w:hAnsi="Arial" w:cs="Arial" w:eastAsia="Arial"/>
                 <w:b w:val="0"/>
+                <w:i w:val="0"/>
                 <w:sz w:val="20"/>
               </w:rPr>
             </w:r>
@@ -271,7 +361,9 @@
             <w:r/>
             <w:r>
               <w:rPr>
+                <w:rFonts w:ascii="Arial" w:hAnsi="Arial" w:cs="Arial" w:eastAsia="Arial"/>
                 <w:b w:val="0"/>
+                <w:i w:val="0"/>
                 <w:sz w:val="20"/>
               </w:rPr>
               <w:t>Current final status of this payment</w:t>
@@ -286,7 +378,9 @@
             <w:r/>
             <w:r>
               <w:rPr>
+                <w:rFonts w:ascii="Arial" w:hAnsi="Arial" w:cs="Arial" w:eastAsia="Arial"/>
                 <w:b w:val="0"/>
+                <w:i w:val="0"/>
                 <w:sz w:val="20"/>
               </w:rPr>
             </w:r>
@@ -299,17 +393,35 @@
         <w:pStyle w:val="Heading1"/>
       </w:pPr>
       <w:r>
+        <w:rPr>
+          <w:rFonts w:ascii="Arial" w:hAnsi="Arial" w:cs="Arial" w:eastAsia="Arial"/>
+          <w:b/>
+          <w:i w:val="0"/>
+          <w:sz w:val="28"/>
+        </w:rPr>
         <w:t>2. Step-by-step: what actually happened?</w:t>
       </w:r>
     </w:p>
     <w:p>
       <w:r>
-        <w:t>Please list the steps in order — from “this payment became due / invoiced” to “status was updated as paid / still chasing”.</w:t>
+        <w:rPr>
+          <w:rFonts w:ascii="Arial" w:hAnsi="Arial" w:cs="Arial" w:eastAsia="Arial"/>
+          <w:b w:val="0"/>
+          <w:i w:val="0"/>
+          <w:sz w:val="22"/>
+        </w:rPr>
+        <w:t>Please list the steps in order, from "this payment became due / invoiced" to "status was updated as paid / still chasing".</w:t>
       </w:r>
     </w:p>
     <w:p>
       <w:r>
-        <w:t>For each step, note where it was recorded (Brain / Excel / email / WeCom daily report / finance system / not recorded).</w:t>
+        <w:rPr>
+          <w:rFonts w:ascii="Arial" w:hAnsi="Arial" w:cs="Arial" w:eastAsia="Arial"/>
+          <w:b w:val="0"/>
+          <w:i w:val="0"/>
+          <w:sz w:val="22"/>
+        </w:rPr>
+        <w:t>For each step, note where it was recorded: Brain / Excel / email / WeCom daily report / finance system / not recorded.</w:t>
       </w:r>
     </w:p>
     <w:tbl>
@@ -334,7 +446,9 @@
             <w:r/>
             <w:r>
               <w:rPr>
+                <w:rFonts w:ascii="Arial" w:hAnsi="Arial" w:cs="Arial" w:eastAsia="Arial"/>
                 <w:b/>
+                <w:i w:val="0"/>
                 <w:sz w:val="20"/>
               </w:rPr>
               <w:t>Step #</w:t>
@@ -349,7 +463,9 @@
             <w:r/>
             <w:r>
               <w:rPr>
+                <w:rFonts w:ascii="Arial" w:hAnsi="Arial" w:cs="Arial" w:eastAsia="Arial"/>
                 <w:b/>
+                <w:i w:val="0"/>
                 <w:sz w:val="20"/>
               </w:rPr>
               <w:t>What happened</w:t>
@@ -364,7 +480,9 @@
             <w:r/>
             <w:r>
               <w:rPr>
+                <w:rFonts w:ascii="Arial" w:hAnsi="Arial" w:cs="Arial" w:eastAsia="Arial"/>
                 <w:b/>
+                <w:i w:val="0"/>
                 <w:sz w:val="20"/>
               </w:rPr>
               <w:t>Who did it</w:t>
@@ -379,7 +497,9 @@
             <w:r/>
             <w:r>
               <w:rPr>
+                <w:rFonts w:ascii="Arial" w:hAnsi="Arial" w:cs="Arial" w:eastAsia="Arial"/>
                 <w:b/>
+                <w:i w:val="0"/>
                 <w:sz w:val="20"/>
               </w:rPr>
               <w:t>Where was it recorded?</w:t>
@@ -394,7 +514,9 @@
             <w:r/>
             <w:r>
               <w:rPr>
+                <w:rFonts w:ascii="Arial" w:hAnsi="Arial" w:cs="Arial" w:eastAsia="Arial"/>
                 <w:b/>
+                <w:i w:val="0"/>
                 <w:sz w:val="20"/>
               </w:rPr>
               <w:t>When (approx. date)</w:t>
@@ -411,7 +533,9 @@
             <w:r/>
             <w:r>
               <w:rPr>
+                <w:rFonts w:ascii="Arial" w:hAnsi="Arial" w:cs="Arial" w:eastAsia="Arial"/>
                 <w:b w:val="0"/>
+                <w:i w:val="0"/>
                 <w:sz w:val="20"/>
               </w:rPr>
               <w:t>1</w:t>
@@ -426,7 +550,9 @@
             <w:r/>
             <w:r>
               <w:rPr>
+                <w:rFonts w:ascii="Arial" w:hAnsi="Arial" w:cs="Arial" w:eastAsia="Arial"/>
                 <w:b w:val="0"/>
+                <w:i w:val="0"/>
                 <w:sz w:val="20"/>
               </w:rPr>
             </w:r>
@@ -440,7 +566,9 @@
             <w:r/>
             <w:r>
               <w:rPr>
+                <w:rFonts w:ascii="Arial" w:hAnsi="Arial" w:cs="Arial" w:eastAsia="Arial"/>
                 <w:b w:val="0"/>
+                <w:i w:val="0"/>
                 <w:sz w:val="20"/>
               </w:rPr>
             </w:r>
@@ -454,7 +582,9 @@
             <w:r/>
             <w:r>
               <w:rPr>
+                <w:rFonts w:ascii="Arial" w:hAnsi="Arial" w:cs="Arial" w:eastAsia="Arial"/>
                 <w:b w:val="0"/>
+                <w:i w:val="0"/>
                 <w:sz w:val="20"/>
               </w:rPr>
             </w:r>
@@ -468,7 +598,9 @@
             <w:r/>
             <w:r>
               <w:rPr>
+                <w:rFonts w:ascii="Arial" w:hAnsi="Arial" w:cs="Arial" w:eastAsia="Arial"/>
                 <w:b w:val="0"/>
+                <w:i w:val="0"/>
                 <w:sz w:val="20"/>
               </w:rPr>
             </w:r>
@@ -484,7 +616,9 @@
             <w:r/>
             <w:r>
               <w:rPr>
+                <w:rFonts w:ascii="Arial" w:hAnsi="Arial" w:cs="Arial" w:eastAsia="Arial"/>
                 <w:b w:val="0"/>
+                <w:i w:val="0"/>
                 <w:sz w:val="20"/>
               </w:rPr>
               <w:t>2</w:t>
@@ -499,7 +633,9 @@
             <w:r/>
             <w:r>
               <w:rPr>
+                <w:rFonts w:ascii="Arial" w:hAnsi="Arial" w:cs="Arial" w:eastAsia="Arial"/>
                 <w:b w:val="0"/>
+                <w:i w:val="0"/>
                 <w:sz w:val="20"/>
               </w:rPr>
             </w:r>
@@ -513,7 +649,9 @@
             <w:r/>
             <w:r>
               <w:rPr>
+                <w:rFonts w:ascii="Arial" w:hAnsi="Arial" w:cs="Arial" w:eastAsia="Arial"/>
                 <w:b w:val="0"/>
+                <w:i w:val="0"/>
                 <w:sz w:val="20"/>
               </w:rPr>
             </w:r>
@@ -527,7 +665,9 @@
             <w:r/>
             <w:r>
               <w:rPr>
+                <w:rFonts w:ascii="Arial" w:hAnsi="Arial" w:cs="Arial" w:eastAsia="Arial"/>
                 <w:b w:val="0"/>
+                <w:i w:val="0"/>
                 <w:sz w:val="20"/>
               </w:rPr>
             </w:r>
@@ -541,7 +681,9 @@
             <w:r/>
             <w:r>
               <w:rPr>
+                <w:rFonts w:ascii="Arial" w:hAnsi="Arial" w:cs="Arial" w:eastAsia="Arial"/>
                 <w:b w:val="0"/>
+                <w:i w:val="0"/>
                 <w:sz w:val="20"/>
               </w:rPr>
             </w:r>
@@ -557,7 +699,9 @@
             <w:r/>
             <w:r>
               <w:rPr>
+                <w:rFonts w:ascii="Arial" w:hAnsi="Arial" w:cs="Arial" w:eastAsia="Arial"/>
                 <w:b w:val="0"/>
+                <w:i w:val="0"/>
                 <w:sz w:val="20"/>
               </w:rPr>
               <w:t>3</w:t>
@@ -572,7 +716,9 @@
             <w:r/>
             <w:r>
               <w:rPr>
+                <w:rFonts w:ascii="Arial" w:hAnsi="Arial" w:cs="Arial" w:eastAsia="Arial"/>
                 <w:b w:val="0"/>
+                <w:i w:val="0"/>
                 <w:sz w:val="20"/>
               </w:rPr>
             </w:r>
@@ -586,7 +732,9 @@
             <w:r/>
             <w:r>
               <w:rPr>
+                <w:rFonts w:ascii="Arial" w:hAnsi="Arial" w:cs="Arial" w:eastAsia="Arial"/>
                 <w:b w:val="0"/>
+                <w:i w:val="0"/>
                 <w:sz w:val="20"/>
               </w:rPr>
             </w:r>
@@ -600,7 +748,9 @@
             <w:r/>
             <w:r>
               <w:rPr>
+                <w:rFonts w:ascii="Arial" w:hAnsi="Arial" w:cs="Arial" w:eastAsia="Arial"/>
                 <w:b w:val="0"/>
+                <w:i w:val="0"/>
                 <w:sz w:val="20"/>
               </w:rPr>
             </w:r>
@@ -614,7 +764,9 @@
             <w:r/>
             <w:r>
               <w:rPr>
+                <w:rFonts w:ascii="Arial" w:hAnsi="Arial" w:cs="Arial" w:eastAsia="Arial"/>
                 <w:b w:val="0"/>
+                <w:i w:val="0"/>
                 <w:sz w:val="20"/>
               </w:rPr>
             </w:r>
@@ -630,7 +782,9 @@
             <w:r/>
             <w:r>
               <w:rPr>
+                <w:rFonts w:ascii="Arial" w:hAnsi="Arial" w:cs="Arial" w:eastAsia="Arial"/>
                 <w:b w:val="0"/>
+                <w:i w:val="0"/>
                 <w:sz w:val="20"/>
               </w:rPr>
               <w:t>4</w:t>
@@ -645,7 +799,9 @@
             <w:r/>
             <w:r>
               <w:rPr>
+                <w:rFonts w:ascii="Arial" w:hAnsi="Arial" w:cs="Arial" w:eastAsia="Arial"/>
                 <w:b w:val="0"/>
+                <w:i w:val="0"/>
                 <w:sz w:val="20"/>
               </w:rPr>
             </w:r>
@@ -659,7 +815,9 @@
             <w:r/>
             <w:r>
               <w:rPr>
+                <w:rFonts w:ascii="Arial" w:hAnsi="Arial" w:cs="Arial" w:eastAsia="Arial"/>
                 <w:b w:val="0"/>
+                <w:i w:val="0"/>
                 <w:sz w:val="20"/>
               </w:rPr>
             </w:r>
@@ -673,7 +831,9 @@
             <w:r/>
             <w:r>
               <w:rPr>
+                <w:rFonts w:ascii="Arial" w:hAnsi="Arial" w:cs="Arial" w:eastAsia="Arial"/>
                 <w:b w:val="0"/>
+                <w:i w:val="0"/>
                 <w:sz w:val="20"/>
               </w:rPr>
             </w:r>
@@ -687,7 +847,9 @@
             <w:r/>
             <w:r>
               <w:rPr>
+                <w:rFonts w:ascii="Arial" w:hAnsi="Arial" w:cs="Arial" w:eastAsia="Arial"/>
                 <w:b w:val="0"/>
+                <w:i w:val="0"/>
                 <w:sz w:val="20"/>
               </w:rPr>
             </w:r>
@@ -703,7 +865,9 @@
             <w:r/>
             <w:r>
               <w:rPr>
+                <w:rFonts w:ascii="Arial" w:hAnsi="Arial" w:cs="Arial" w:eastAsia="Arial"/>
                 <w:b w:val="0"/>
+                <w:i w:val="0"/>
                 <w:sz w:val="20"/>
               </w:rPr>
               <w:t>5</w:t>
@@ -718,7 +882,9 @@
             <w:r/>
             <w:r>
               <w:rPr>
+                <w:rFonts w:ascii="Arial" w:hAnsi="Arial" w:cs="Arial" w:eastAsia="Arial"/>
                 <w:b w:val="0"/>
+                <w:i w:val="0"/>
                 <w:sz w:val="20"/>
               </w:rPr>
             </w:r>
@@ -732,7 +898,9 @@
             <w:r/>
             <w:r>
               <w:rPr>
+                <w:rFonts w:ascii="Arial" w:hAnsi="Arial" w:cs="Arial" w:eastAsia="Arial"/>
                 <w:b w:val="0"/>
+                <w:i w:val="0"/>
                 <w:sz w:val="20"/>
               </w:rPr>
             </w:r>
@@ -746,7 +914,9 @@
             <w:r/>
             <w:r>
               <w:rPr>
+                <w:rFonts w:ascii="Arial" w:hAnsi="Arial" w:cs="Arial" w:eastAsia="Arial"/>
                 <w:b w:val="0"/>
+                <w:i w:val="0"/>
                 <w:sz w:val="20"/>
               </w:rPr>
             </w:r>
@@ -760,7 +930,9 @@
             <w:r/>
             <w:r>
               <w:rPr>
+                <w:rFonts w:ascii="Arial" w:hAnsi="Arial" w:cs="Arial" w:eastAsia="Arial"/>
                 <w:b w:val="0"/>
+                <w:i w:val="0"/>
                 <w:sz w:val="20"/>
               </w:rPr>
             </w:r>
@@ -776,7 +948,9 @@
             <w:r/>
             <w:r>
               <w:rPr>
+                <w:rFonts w:ascii="Arial" w:hAnsi="Arial" w:cs="Arial" w:eastAsia="Arial"/>
                 <w:b w:val="0"/>
+                <w:i w:val="0"/>
                 <w:sz w:val="20"/>
               </w:rPr>
               <w:t>6</w:t>
@@ -791,7 +965,9 @@
             <w:r/>
             <w:r>
               <w:rPr>
+                <w:rFonts w:ascii="Arial" w:hAnsi="Arial" w:cs="Arial" w:eastAsia="Arial"/>
                 <w:b w:val="0"/>
+                <w:i w:val="0"/>
                 <w:sz w:val="20"/>
               </w:rPr>
             </w:r>
@@ -805,7 +981,9 @@
             <w:r/>
             <w:r>
               <w:rPr>
+                <w:rFonts w:ascii="Arial" w:hAnsi="Arial" w:cs="Arial" w:eastAsia="Arial"/>
                 <w:b w:val="0"/>
+                <w:i w:val="0"/>
                 <w:sz w:val="20"/>
               </w:rPr>
             </w:r>
@@ -819,7 +997,9 @@
             <w:r/>
             <w:r>
               <w:rPr>
+                <w:rFonts w:ascii="Arial" w:hAnsi="Arial" w:cs="Arial" w:eastAsia="Arial"/>
                 <w:b w:val="0"/>
+                <w:i w:val="0"/>
                 <w:sz w:val="20"/>
               </w:rPr>
             </w:r>
@@ -833,7 +1013,9 @@
             <w:r/>
             <w:r>
               <w:rPr>
+                <w:rFonts w:ascii="Arial" w:hAnsi="Arial" w:cs="Arial" w:eastAsia="Arial"/>
                 <w:b w:val="0"/>
+                <w:i w:val="0"/>
                 <w:sz w:val="20"/>
               </w:rPr>
             </w:r>
@@ -846,94 +1028,267 @@
         <w:pStyle w:val="Heading1"/>
       </w:pPr>
       <w:r>
+        <w:rPr>
+          <w:rFonts w:ascii="Arial" w:hAnsi="Arial" w:cs="Arial" w:eastAsia="Arial"/>
+          <w:b/>
+          <w:i w:val="0"/>
+          <w:sz w:val="28"/>
+        </w:rPr>
         <w:t>3. Key questions (short answers)</w:t>
       </w:r>
     </w:p>
     <w:p>
       <w:r>
+        <w:rPr>
+          <w:rFonts w:ascii="Arial" w:hAnsi="Arial" w:cs="Arial" w:eastAsia="Arial"/>
+          <w:b/>
+          <w:i w:val="0"/>
+          <w:sz w:val="22"/>
+        </w:rPr>
         <w:t>1. Where did you first know this payment needed follow-up?</w:t>
-        <w:br/>
-        <w:t>(e.g. contract schedule / finance notice / email / Excel / Brain / other)</w:t>
       </w:r>
     </w:p>
     <w:p>
       <w:r>
-        <w:t>______________________________________________________________________</w:t>
+        <w:rPr>
+          <w:rFonts w:ascii="Arial" w:hAnsi="Arial" w:cs="Arial" w:eastAsia="Arial"/>
+          <w:b w:val="0"/>
+          <w:i/>
+          <w:sz w:val="20"/>
+        </w:rPr>
+        <w:t>(Examples: contract schedule / finance notice / email / Excel / Brain / other)</w:t>
       </w:r>
     </w:p>
     <w:p>
       <w:r>
-        <w:t>______________________________________________________________________</w:t>
+        <w:rPr>
+          <w:rFonts w:ascii="Arial" w:hAnsi="Arial" w:cs="Arial" w:eastAsia="Arial"/>
+          <w:b w:val="0"/>
+          <w:i w:val="0"/>
+          <w:sz w:val="22"/>
+        </w:rPr>
+        <w:t>Answer:</w:t>
       </w:r>
     </w:p>
     <w:p>
       <w:r>
+        <w:rPr>
+          <w:rFonts w:ascii="Arial" w:hAnsi="Arial" w:cs="Arial" w:eastAsia="Arial"/>
+          <w:b w:val="0"/>
+          <w:i w:val="0"/>
+          <w:sz w:val="22"/>
+        </w:rPr>
+      </w:r>
+    </w:p>
+    <w:p>
+      <w:r>
+        <w:rPr>
+          <w:rFonts w:ascii="Arial" w:hAnsi="Arial" w:cs="Arial" w:eastAsia="Arial"/>
+          <w:b w:val="0"/>
+          <w:i w:val="0"/>
+          <w:sz w:val="22"/>
+        </w:rPr>
+      </w:r>
+    </w:p>
+    <w:p>
+      <w:r>
+        <w:rPr>
+          <w:rFonts w:ascii="Arial" w:hAnsi="Arial" w:cs="Arial" w:eastAsia="Arial"/>
+          <w:b/>
+          <w:i w:val="0"/>
+          <w:sz w:val="22"/>
+        </w:rPr>
         <w:t>2. Where do you normally update the payment status during chasing?</w:t>
-        <w:br/>
+      </w:r>
+    </w:p>
+    <w:p>
+      <w:r>
+        <w:rPr>
+          <w:rFonts w:ascii="Arial" w:hAnsi="Arial" w:cs="Arial" w:eastAsia="Arial"/>
+          <w:b w:val="0"/>
+          <w:i/>
+          <w:sz w:val="20"/>
+        </w:rPr>
         <w:t>(Brain / Excel / daily report / email only / other)</w:t>
       </w:r>
     </w:p>
     <w:p>
       <w:r>
-        <w:t>______________________________________________________________________</w:t>
+        <w:rPr>
+          <w:rFonts w:ascii="Arial" w:hAnsi="Arial" w:cs="Arial" w:eastAsia="Arial"/>
+          <w:b w:val="0"/>
+          <w:i w:val="0"/>
+          <w:sz w:val="22"/>
+        </w:rPr>
+        <w:t>Answer:</w:t>
       </w:r>
     </w:p>
     <w:p>
       <w:r>
-        <w:t>______________________________________________________________________</w:t>
+        <w:rPr>
+          <w:rFonts w:ascii="Arial" w:hAnsi="Arial" w:cs="Arial" w:eastAsia="Arial"/>
+          <w:b w:val="0"/>
+          <w:i w:val="0"/>
+          <w:sz w:val="22"/>
+        </w:rPr>
       </w:r>
     </w:p>
     <w:p>
       <w:r>
-        <w:t>3. Who confirms “money has arrived”?</w:t>
-        <w:br/>
-        <w:t>(PM / commercial / finance / other)</w:t>
-        <w:br/>
-        <w:t>And where is that confirmation recorded?</w:t>
+        <w:rPr>
+          <w:rFonts w:ascii="Arial" w:hAnsi="Arial" w:cs="Arial" w:eastAsia="Arial"/>
+          <w:b w:val="0"/>
+          <w:i w:val="0"/>
+          <w:sz w:val="22"/>
+        </w:rPr>
       </w:r>
     </w:p>
     <w:p>
       <w:r>
-        <w:t>______________________________________________________________________</w:t>
+        <w:rPr>
+          <w:rFonts w:ascii="Arial" w:hAnsi="Arial" w:cs="Arial" w:eastAsia="Arial"/>
+          <w:b/>
+          <w:i w:val="0"/>
+          <w:sz w:val="22"/>
+        </w:rPr>
+        <w:t>3. Who confirms that money has arrived, and where is that confirmation recorded?</w:t>
       </w:r>
     </w:p>
     <w:p>
       <w:r>
-        <w:t>______________________________________________________________________</w:t>
+        <w:rPr>
+          <w:rFonts w:ascii="Arial" w:hAnsi="Arial" w:cs="Arial" w:eastAsia="Arial"/>
+          <w:b w:val="0"/>
+          <w:i/>
+          <w:sz w:val="20"/>
+        </w:rPr>
+        <w:t>(PM / commercial / finance / other)</w:t>
       </w:r>
     </w:p>
     <w:p>
       <w:r>
+        <w:rPr>
+          <w:rFonts w:ascii="Arial" w:hAnsi="Arial" w:cs="Arial" w:eastAsia="Arial"/>
+          <w:b w:val="0"/>
+          <w:i w:val="0"/>
+          <w:sz w:val="22"/>
+        </w:rPr>
+        <w:t>Answer:</w:t>
+      </w:r>
+    </w:p>
+    <w:p>
+      <w:r>
+        <w:rPr>
+          <w:rFonts w:ascii="Arial" w:hAnsi="Arial" w:cs="Arial" w:eastAsia="Arial"/>
+          <w:b w:val="0"/>
+          <w:i w:val="0"/>
+          <w:sz w:val="22"/>
+        </w:rPr>
+      </w:r>
+    </w:p>
+    <w:p>
+      <w:r>
+        <w:rPr>
+          <w:rFonts w:ascii="Arial" w:hAnsi="Arial" w:cs="Arial" w:eastAsia="Arial"/>
+          <w:b w:val="0"/>
+          <w:i w:val="0"/>
+          <w:sz w:val="22"/>
+        </w:rPr>
+      </w:r>
+    </w:p>
+    <w:p>
+      <w:r>
+        <w:rPr>
+          <w:rFonts w:ascii="Arial" w:hAnsi="Arial" w:cs="Arial" w:eastAsia="Arial"/>
+          <w:b/>
+          <w:i w:val="0"/>
+          <w:sz w:val="22"/>
+        </w:rPr>
         <w:t>4. Did any information get delayed or missed in this case? If yes, at which step?</w:t>
       </w:r>
     </w:p>
     <w:p>
       <w:r>
-        <w:t>______________________________________________________________________</w:t>
+        <w:rPr>
+          <w:rFonts w:ascii="Arial" w:hAnsi="Arial" w:cs="Arial" w:eastAsia="Arial"/>
+          <w:b w:val="0"/>
+          <w:i w:val="0"/>
+          <w:sz w:val="22"/>
+        </w:rPr>
+        <w:t>Answer:</w:t>
       </w:r>
     </w:p>
     <w:p>
       <w:r>
-        <w:t>______________________________________________________________________</w:t>
+        <w:rPr>
+          <w:rFonts w:ascii="Arial" w:hAnsi="Arial" w:cs="Arial" w:eastAsia="Arial"/>
+          <w:b w:val="0"/>
+          <w:i w:val="0"/>
+          <w:sz w:val="22"/>
+        </w:rPr>
       </w:r>
     </w:p>
     <w:p>
       <w:r>
-        <w:t>5. Which tool do you trust most for the real status today?</w:t>
-        <w:br/>
-        <w:t>(Brain / Excel / finance / email thread / other)</w:t>
-        <w:br/>
-        <w:t>Why?</w:t>
+        <w:rPr>
+          <w:rFonts w:ascii="Arial" w:hAnsi="Arial" w:cs="Arial" w:eastAsia="Arial"/>
+          <w:b w:val="0"/>
+          <w:i w:val="0"/>
+          <w:sz w:val="22"/>
+        </w:rPr>
       </w:r>
     </w:p>
     <w:p>
       <w:r>
-        <w:t>______________________________________________________________________</w:t>
+        <w:rPr>
+          <w:rFonts w:ascii="Arial" w:hAnsi="Arial" w:cs="Arial" w:eastAsia="Arial"/>
+          <w:b/>
+          <w:i w:val="0"/>
+          <w:sz w:val="22"/>
+        </w:rPr>
+        <w:t>5. Which tool do you trust most for the real status today, and why?</w:t>
       </w:r>
     </w:p>
     <w:p>
       <w:r>
-        <w:t>______________________________________________________________________</w:t>
+        <w:rPr>
+          <w:rFonts w:ascii="Arial" w:hAnsi="Arial" w:cs="Arial" w:eastAsia="Arial"/>
+          <w:b w:val="0"/>
+          <w:i/>
+          <w:sz w:val="20"/>
+        </w:rPr>
+        <w:t>(Brain / Excel / finance / email thread / other)</w:t>
+      </w:r>
+    </w:p>
+    <w:p>
+      <w:r>
+        <w:rPr>
+          <w:rFonts w:ascii="Arial" w:hAnsi="Arial" w:cs="Arial" w:eastAsia="Arial"/>
+          <w:b w:val="0"/>
+          <w:i w:val="0"/>
+          <w:sz w:val="22"/>
+        </w:rPr>
+        <w:t>Answer:</w:t>
+      </w:r>
+    </w:p>
+    <w:p>
+      <w:r>
+        <w:rPr>
+          <w:rFonts w:ascii="Arial" w:hAnsi="Arial" w:cs="Arial" w:eastAsia="Arial"/>
+          <w:b w:val="0"/>
+          <w:i w:val="0"/>
+          <w:sz w:val="22"/>
+        </w:rPr>
+      </w:r>
+    </w:p>
+    <w:p>
+      <w:r>
+        <w:rPr>
+          <w:rFonts w:ascii="Arial" w:hAnsi="Arial" w:cs="Arial" w:eastAsia="Arial"/>
+          <w:b w:val="0"/>
+          <w:i w:val="0"/>
+          <w:sz w:val="22"/>
+        </w:rPr>
       </w:r>
     </w:p>
     <w:p>
@@ -941,11 +1296,23 @@
         <w:pStyle w:val="Heading1"/>
       </w:pPr>
       <w:r>
+        <w:rPr>
+          <w:rFonts w:ascii="Arial" w:hAnsi="Arial" w:cs="Arial" w:eastAsia="Arial"/>
+          <w:b/>
+          <w:i w:val="0"/>
+          <w:sz w:val="28"/>
+        </w:rPr>
         <w:t>4. Sample materials (optional but very helpful)</w:t>
       </w:r>
     </w:p>
     <w:p>
       <w:r>
+        <w:rPr>
+          <w:rFonts w:ascii="Arial" w:hAnsi="Arial" w:cs="Arial" w:eastAsia="Arial"/>
+          <w:b w:val="0"/>
+          <w:i w:val="0"/>
+          <w:sz w:val="22"/>
+        </w:rPr>
         <w:t>If possible, please attach or forward (anonymized is fine):</w:t>
       </w:r>
     </w:p>
@@ -954,6 +1321,12 @@
         <w:pStyle w:val="ListBullet"/>
       </w:pPr>
       <w:r>
+        <w:rPr>
+          <w:rFonts w:ascii="Arial" w:hAnsi="Arial" w:cs="Arial" w:eastAsia="Arial"/>
+          <w:b w:val="0"/>
+          <w:i w:val="0"/>
+          <w:sz w:val="22"/>
+        </w:rPr>
         <w:t>Screenshot or export of the Excel row / Brain payment status for this case</w:t>
       </w:r>
     </w:p>
@@ -962,6 +1335,12 @@
         <w:pStyle w:val="ListBullet"/>
       </w:pPr>
       <w:r>
+        <w:rPr>
+          <w:rFonts w:ascii="Arial" w:hAnsi="Arial" w:cs="Arial" w:eastAsia="Arial"/>
+          <w:b w:val="0"/>
+          <w:i w:val="0"/>
+          <w:sz w:val="22"/>
+        </w:rPr>
         <w:t>One daily report line that mentioned this payment (if any)</w:t>
       </w:r>
     </w:p>
@@ -970,7 +1349,13 @@
         <w:pStyle w:val="ListBullet"/>
       </w:pPr>
       <w:r>
-        <w:t>One follow-up email subject line / date (no need for full confidential body)</w:t>
+        <w:rPr>
+          <w:rFonts w:ascii="Arial" w:hAnsi="Arial" w:cs="Arial" w:eastAsia="Arial"/>
+          <w:b w:val="0"/>
+          <w:i w:val="0"/>
+          <w:sz w:val="22"/>
+        </w:rPr>
+        <w:t>One follow-up email subject line and date (full confidential body not required)</w:t>
       </w:r>
     </w:p>
     <w:p>
@@ -978,6 +1363,12 @@
         <w:pStyle w:val="Heading1"/>
       </w:pPr>
       <w:r>
+        <w:rPr>
+          <w:rFonts w:ascii="Arial" w:hAnsi="Arial" w:cs="Arial" w:eastAsia="Arial"/>
+          <w:b/>
+          <w:i w:val="0"/>
+          <w:sz w:val="28"/>
+        </w:rPr>
         <w:t>5. Respondent</w:t>
       </w:r>
     </w:p>
@@ -1001,7 +1392,9 @@
             <w:r/>
             <w:r>
               <w:rPr>
+                <w:rFonts w:ascii="Arial" w:hAnsi="Arial" w:cs="Arial" w:eastAsia="Arial"/>
                 <w:b/>
+                <w:i w:val="0"/>
                 <w:sz w:val="20"/>
               </w:rPr>
               <w:t>Name</w:t>
@@ -1016,7 +1409,9 @@
             <w:r/>
             <w:r>
               <w:rPr>
+                <w:rFonts w:ascii="Arial" w:hAnsi="Arial" w:cs="Arial" w:eastAsia="Arial"/>
                 <w:b/>
+                <w:i w:val="0"/>
                 <w:sz w:val="20"/>
               </w:rPr>
               <w:t>Role</w:t>
@@ -1031,7 +1426,9 @@
             <w:r/>
             <w:r>
               <w:rPr>
+                <w:rFonts w:ascii="Arial" w:hAnsi="Arial" w:cs="Arial" w:eastAsia="Arial"/>
                 <w:b/>
+                <w:i w:val="0"/>
                 <w:sz w:val="20"/>
               </w:rPr>
               <w:t>Date</w:t>
@@ -1048,7 +1445,9 @@
             <w:r/>
             <w:r>
               <w:rPr>
+                <w:rFonts w:ascii="Arial" w:hAnsi="Arial" w:cs="Arial" w:eastAsia="Arial"/>
                 <w:b w:val="0"/>
+                <w:i w:val="0"/>
                 <w:sz w:val="20"/>
               </w:rPr>
             </w:r>
@@ -1062,7 +1461,9 @@
             <w:r/>
             <w:r>
               <w:rPr>
+                <w:rFonts w:ascii="Arial" w:hAnsi="Arial" w:cs="Arial" w:eastAsia="Arial"/>
                 <w:b w:val="0"/>
+                <w:i w:val="0"/>
                 <w:sz w:val="20"/>
               </w:rPr>
             </w:r>
@@ -1076,7 +1477,9 @@
             <w:r/>
             <w:r>
               <w:rPr>
+                <w:rFonts w:ascii="Arial" w:hAnsi="Arial" w:cs="Arial" w:eastAsia="Arial"/>
                 <w:b w:val="0"/>
+                <w:i w:val="0"/>
                 <w:sz w:val="20"/>
               </w:rPr>
             </w:r>
@@ -1088,19 +1491,23 @@
     <w:p>
       <w:r>
         <w:rPr>
+          <w:rFonts w:ascii="Arial" w:hAnsi="Arial" w:cs="Arial" w:eastAsia="Arial"/>
+          <w:b w:val="0"/>
           <w:i/>
+          <w:sz w:val="22"/>
         </w:rPr>
-        <w:t>Thank you — one real case is enough for this round. We will use it to map the actual data flow before proposing any system changes.</w:t>
+        <w:t>Thank you. One real case is enough for this round. We will use it to map the actual data flow before proposing any system changes.</w:t>
       </w:r>
     </w:p>
     <w:p>
       <w:r>
         <w:rPr>
+          <w:rFonts w:ascii="Arial" w:hAnsi="Arial" w:cs="Arial" w:eastAsia="Arial"/>
+          <w:b w:val="0"/>
           <w:i/>
-          <w:color w:val="666666"/>
           <w:sz w:val="18"/>
         </w:rPr>
-        <w:t>Internal working draft — Belt Collins / BCI IT &amp; AI</w:t>
+        <w:t>Internal working draft - Belt Collins / BCI IT &amp; AI</w:t>
       </w:r>
     </w:p>
     <w:sectPr>
@@ -1477,7 +1884,8 @@
     <w:qFormat/>
     <w:rsid w:val="00FC693F"/>
     <w:rPr>
-      <w:rFonts w:ascii="Calibri" w:hAnsi="Calibri" w:eastAsia="Calibri"/>
+      <w:rFonts w:ascii="Arial" w:hAnsi="Arial" w:cs="Arial" w:eastAsia="Arial"/>
+      <w:color w:val="000000"/>
       <w:sz w:val="22"/>
     </w:rPr>
   </w:style>
@@ -1540,10 +1948,10 @@
       <w:outlineLvl w:val="0"/>
     </w:pPr>
     <w:rPr>
-      <w:rFonts w:asciiTheme="majorHAnsi" w:eastAsiaTheme="majorEastAsia" w:hAnsiTheme="majorHAnsi" w:cstheme="majorBidi"/>
+      <w:rFonts w:asciiTheme="majorHAnsi" w:eastAsiaTheme="majorEastAsia" w:hAnsiTheme="majorHAnsi" w:cstheme="majorBidi" w:ascii="Arial" w:hAnsi="Arial" w:cs="Arial" w:eastAsia="Arial"/>
       <w:b/>
       <w:bCs/>
-      <w:color w:val="365F91" w:themeColor="accent1" w:themeShade="BF"/>
+      <w:color w:val="000000"/>
       <w:sz w:val="28"/>
       <w:szCs w:val="28"/>
     </w:rPr>
@@ -1564,10 +1972,10 @@
       <w:outlineLvl w:val="1"/>
     </w:pPr>
     <w:rPr>
-      <w:rFonts w:asciiTheme="majorHAnsi" w:eastAsiaTheme="majorEastAsia" w:hAnsiTheme="majorHAnsi" w:cstheme="majorBidi"/>
+      <w:rFonts w:asciiTheme="majorHAnsi" w:eastAsiaTheme="majorEastAsia" w:hAnsiTheme="majorHAnsi" w:cstheme="majorBidi" w:ascii="Arial" w:hAnsi="Arial" w:cs="Arial" w:eastAsia="Arial"/>
       <w:b/>
       <w:bCs/>
-      <w:color w:val="4F81BD" w:themeColor="accent1"/>
+      <w:color w:val="000000"/>
       <w:sz w:val="26"/>
       <w:szCs w:val="26"/>
     </w:rPr>
@@ -1829,8 +2237,8 @@
       <w:contextualSpacing/>
     </w:pPr>
     <w:rPr>
-      <w:rFonts w:asciiTheme="majorHAnsi" w:eastAsiaTheme="majorEastAsia" w:hAnsiTheme="majorHAnsi" w:cstheme="majorBidi"/>
-      <w:color w:val="17365D" w:themeColor="text2" w:themeShade="BF"/>
+      <w:rFonts w:asciiTheme="majorHAnsi" w:eastAsiaTheme="majorEastAsia" w:hAnsiTheme="majorHAnsi" w:cstheme="majorBidi" w:ascii="Arial" w:hAnsi="Arial" w:cs="Arial" w:eastAsia="Arial"/>
+      <w:color w:val="000000"/>
       <w:spacing w:val="5"/>
       <w:kern w:val="28"/>
       <w:sz w:val="52"/>
@@ -2009,6 +2417,10 @@
       </w:numPr>
       <w:contextualSpacing/>
     </w:pPr>
+    <w:rPr>
+      <w:rFonts w:ascii="Arial" w:hAnsi="Arial" w:cs="Arial" w:eastAsia="Arial"/>
+      <w:color w:val="000000"/>
+    </w:rPr>
   </w:style>
   <w:style w:type="paragraph" w:styleId="ListBullet2">
     <w:name w:val="List Bullet 2"/>

</xml_diff>